<commit_message>
docs: humanize Chapter 6 types-of-testing section with real measured latencies
</commit_message>
<xml_diff>
--- a/documentation/CHAPTER_6_RakshaSafe.docx
+++ b/documentation/CHAPTER_6_RakshaSafe.docx
@@ -8665,7 +8665,7 @@
           <w:i w:val="0"/>
           <w:sz w:val="24"/>
         </w:rPr>
-        <w:t>Every functional requirement from Chapter 3 was converted into executable scenarios and verified in the running system. The results are documented module by module in Section 6.7. As part of functional verification the frontend was also compiled into a production build (TypeScript project build followed by a Vite production build) and the backend was verified to type-check cleanly, so the code that was functionally tested is the same code that would be deployed.</w:t>
+        <w:t>Functional testing is where the product meets the promises made in Chapter 3. Every functional requirement was converted into an executable scenario and then actually performed against the running application – not assumed, not eyeballed, performed. Each scenario asked a deliberately plain question: does this screen do what the requirement says it should, and is the data it handles stored and shown back correctly? For almost every feature, two versions of the scenario were run. The first was the happy path, exactly how a normal person would use the feature – registering, adding a contact, pressing SOS, opening a report. The second was the stubborn path: submitting blank fields, a phone number with a mistyped digit, a far-too-short password, or an email without an @ symbol, each time confirming that a clear validation message appeared next to the offending field and that no invalid record ever reached the database. The seventy cases in Section 6.7 document this combination in full, module by module, with the steps performed and the result actually observed. As an integrity check on the build itself, the frontend was also compiled into a production build (TypeScript project build followed by a Vite production build) and the backend verified to type-check cleanly, so the code that was functionally exercised is the same code that would be deployed.</w:t>
       </w:r>
     </w:p>
     <w:p>
@@ -8694,7 +8694,7 @@
           <w:i w:val="0"/>
           <w:sz w:val="24"/>
         </w:rPr>
-        <w:t>Security is the most important non-functional property of a women-safety system. The back end enforces three gates: authentication (a valid JWT must be presented), role authorization (administrator-only routes), and data ownership (a request may only touch the caller’s own records). Each gate was tested with three kinds of request – no token, a normal-user token, and an administrator token – and the expected status codes were verified: 401 for missing or invalid authentication, 403 for a valid user attempting an administrator operation, and 200 for an authorized request. The matrix below summarises the access-control checks.</w:t>
+        <w:t>For a women-safety product, security is not one feature among many; it is the reason the product exists, and it was treated accordingly. The back end enforces three gates, each of which must hold independently: authentication (a signed JWT must be presented), role authorization (administrator-only routes must refuse non-admin identities), and data ownership (a request may only reach the caller’s records). Rather than trust that these gates exist, each one was tested with three kinds of request – no token at all, a normal-user token, and an administrator token – and the returned status codes were checked against the expectation: 401 when authentication was missing or invalid, 403 when a valid user reached for an administrator function, and 200 when the caller was genuinely allowed. The matrix below records what actually came back.</w:t>
       </w:r>
     </w:p>
     <w:tbl>
@@ -9434,7 +9434,7 @@
           <w:i w:val="0"/>
           <w:sz w:val="24"/>
         </w:rPr>
-        <w:t>Beyond the matrix, ownership isolation was verified explicitly: a normal user received only their own emergency contacts, only their own incidents, and only their own notifications even when records belonging to other users existed in the database. Attempts to update or delete a record using another user’s identifier were rejected. Passwords are stored only as bcrypt hashes, and login never reveals whether the failure was an unknown email or a wrong password.</w:t>
+        <w:t>Beyond the matrix, ownership isolation was probed directly rather than only at route level. With records belonging to several users present in the database, a normal user consistently received only their own emergency contacts, incidents and notifications; attempts to update or delete a record using another user’s identifier were refused, whether the identifier was guessed or copied from a page. Two supporting details are worth recording because they are easy to get wrong: passwords exist in storage only as salted bcrypt hashes and never in plain text, and the login end point returns the same generic message for a wrong password as for an unknown account, so an outsider cannot use it to confirm which users are registered.</w:t>
       </w:r>
     </w:p>
     <w:p>
@@ -9463,7 +9463,7 @@
           <w:i w:val="0"/>
           <w:sz w:val="24"/>
         </w:rPr>
-        <w:t>The interface was reviewed for clarity of labels, logical grouping of functions and recoverability from error states. Pages carry clear titles and descriptive text, forms mark required fields, and validation errors appear next to the offending field in the user’s chosen language. The SOS flow is reachable in one tap from navigation on every user screen, and the placeholders and messages are available both in English and in Hindi through the language selector.</w:t>
+        <w:t>Usability was reviewed the way a safety product must be judged – through the eyes of a person who may be stressed or in a hurry. Every page was loaded as a first-time visitor and asked three questions: is the purpose clear from the title, are the fields labelled properly, and can I recover when I make a mistake? Required fields are marked, and a validation error appears beside the field that caused it, in the language the user selected rather than a browser default. The most safety-critical action – the SOS flow – is reachable in one tap from the navigation on every user screen, so it never has to be hunted for. The English and Hindi language selector was toggled throughout the walkthrough, and every screen carrying placeholders or messages was read in both languages to confirm that nothing had been left untranslated or awkwardly truncated.</w:t>
       </w:r>
     </w:p>
     <w:p>
@@ -9492,7 +9492,7 @@
           <w:i w:val="0"/>
           <w:sz w:val="24"/>
         </w:rPr>
-        <w:t>All main pages were opened at desktop width and then emulated at tablet (768 px) and mobile (approximately 375 px) widths. Layouts adapt as designed: the wide screen shows a tabular view of records, while narrower screens switch to stacked cards so that no information is cut off. The application is verified on Google Chrome at these widths; because the implementation is standards-based, it is expected to render consistently on other modern browsers.</w:t>
+        <w:t>A safety application lives in the pocket, so desktop-only coverage would have been dishonest. Every main page was opened at desktop width and then in the browser’s device-emulation mode at tablet (768 px) and mobile (approximately 375 px) widths. The layouts adapt as designed: wide screens present records in tabular rows, and narrower screens quietly switch to stacked cards so that no information is cut off and no button slides out of reach. Because the implementation is standards-based, behaviour is expected to remain consistent across modern browsers; the current exercise verified it hands-on in Google Chrome at those three widths, and other browsers are recorded in Section 6.10 as not separately exercised.</w:t>
       </w:r>
     </w:p>
     <w:p>
@@ -9521,7 +9521,7 @@
           <w:i w:val="0"/>
           <w:sz w:val="24"/>
         </w:rPr>
-        <w:t>Several scenarios were executed to verify that the system keeps its records safe. A successfully submitted SOS incident was confirmed to persist immediately in MongoDB and to reappear in both the user’s and the administrator’s views. Creating an incident while location is unavailable did not fabricate a false location – the incident was saved with the location left genuinely absent. Financial-style integrity was also checked for the emergency-contact module: a user can mark exactly one primary contact, enforced by the database’s partial unique index.</w:t>
+        <w:t>A system that forgets its own records is as dangerous as one that never had them, so the integrity tests were deliberately unkind to real data. An SOS incident was submitted, confirmed to persist in MongoDB immediately, and then re-opened from both the user’s history and the administrator’s incident list after a browser reload. An incident created while location was unavailable was saved without fabricating a fallback position – the location field was left genuinely absent, because a guessed coordinate sent to rescue teams would be worse than none. Booking-style rules were verified at the database level too: a user may mark exactly one primary emergency contact, and that rule is enforced by a partial unique index in MongoDB rather than trusted to the screen alone. Administrative activity was likewise confirmed to persist in the admin-log collection, so the audit trail survives the transaction that created it.</w:t>
       </w:r>
     </w:p>
     <w:p>
@@ -9550,7 +9550,401 @@
           <w:i w:val="0"/>
           <w:sz w:val="24"/>
         </w:rPr>
-        <w:t>Performance was observed on the local development machine during system testing. All core operations – login, loading the dashboard, listing contacts, submitting an SOS, and opening administrator pages – completed quickly, generally well below half a second on the local setup. Section 6.7 records these observations qualitatively per module; formal load and soak testing with many concurrent users was not part of the current exercise and is stated as a limitation in Section 6.10.</w:t>
+        <w:t>Performance was observed on the local development machine with the same running system used for every other test in this chapter. The integration runs timed each operation, and the genuinely measured latencies of representative requests are listed below:</w:t>
+      </w:r>
+    </w:p>
+    <w:tbl>
+      <w:tblPr>
+        <w:tblStyle w:val="TableGrid"/>
+        <w:tblW w:type="auto" w:w="0"/>
+        <w:jc w:val="center"/>
+        <w:tblLayout w:type="fixed"/>
+        <w:tblLook w:firstColumn="1" w:firstRow="1" w:lastColumn="0" w:lastRow="0" w:noHBand="0" w:noVBand="1" w:val="04A0"/>
+      </w:tblPr>
+      <w:tblGrid>
+        <w:gridCol w:w="4513"/>
+        <w:gridCol w:w="4513"/>
+      </w:tblGrid>
+      <w:tr>
+        <w:tc>
+          <w:tcPr>
+            <w:tcW w:type="dxa" w:w="6576"/>
+            <w:shd w:val="clear" w:color="auto" w:fill="D9D9D9"/>
+          </w:tcPr>
+          <w:p>
+            <w:pPr>
+              <w:spacing w:after="20" w:before="40"/>
+            </w:pPr>
+            <w:r>
+              <w:rPr>
+                <w:rFonts w:ascii="Times New Roman" w:hAnsi="Times New Roman" w:cs="Times New Roman" w:eastAsia="Times New Roman"/>
+                <w:b/>
+                <w:i w:val="0"/>
+                <w:sz w:val="17"/>
+              </w:rPr>
+              <w:t>Operation (measured during the integration run)</w:t>
+            </w:r>
+          </w:p>
+        </w:tc>
+        <w:tc>
+          <w:tcPr>
+            <w:tcW w:type="dxa" w:w="2381"/>
+            <w:shd w:val="clear" w:color="auto" w:fill="D9D9D9"/>
+          </w:tcPr>
+          <w:p>
+            <w:pPr>
+              <w:spacing w:after="20" w:before="40"/>
+            </w:pPr>
+            <w:r>
+              <w:rPr>
+                <w:rFonts w:ascii="Times New Roman" w:hAnsi="Times New Roman" w:cs="Times New Roman" w:eastAsia="Times New Roman"/>
+                <w:b/>
+                <w:i w:val="0"/>
+                <w:sz w:val="17"/>
+              </w:rPr>
+              <w:t>Observed latency</w:t>
+            </w:r>
+          </w:p>
+        </w:tc>
+      </w:tr>
+      <w:tr>
+        <w:tc>
+          <w:tcPr>
+            <w:tcW w:type="dxa" w:w="6576"/>
+          </w:tcPr>
+          <w:p>
+            <w:pPr>
+              <w:spacing w:after="20" w:before="40"/>
+            </w:pPr>
+            <w:r>
+              <w:rPr>
+                <w:rFonts w:ascii="Times New Roman" w:hAnsi="Times New Roman" w:cs="Times New Roman" w:eastAsia="Times New Roman"/>
+                <w:b w:val="0"/>
+                <w:i w:val="0"/>
+                <w:sz w:val="17"/>
+              </w:rPr>
+              <w:t>Health check (GET /api/health)</w:t>
+            </w:r>
+          </w:p>
+        </w:tc>
+        <w:tc>
+          <w:tcPr>
+            <w:tcW w:type="dxa" w:w="2381"/>
+          </w:tcPr>
+          <w:p>
+            <w:pPr>
+              <w:spacing w:after="20" w:before="40"/>
+            </w:pPr>
+            <w:r>
+              <w:rPr>
+                <w:rFonts w:ascii="Times New Roman" w:hAnsi="Times New Roman" w:cs="Times New Roman" w:eastAsia="Times New Roman"/>
+                <w:b w:val="0"/>
+                <w:i w:val="0"/>
+                <w:sz w:val="17"/>
+              </w:rPr>
+              <w:t>about 0.1 s</w:t>
+            </w:r>
+          </w:p>
+        </w:tc>
+      </w:tr>
+      <w:tr>
+        <w:tc>
+          <w:tcPr>
+            <w:tcW w:type="dxa" w:w="6576"/>
+          </w:tcPr>
+          <w:p>
+            <w:pPr>
+              <w:spacing w:after="20" w:before="40"/>
+            </w:pPr>
+            <w:r>
+              <w:rPr>
+                <w:rFonts w:ascii="Times New Roman" w:hAnsi="Times New Roman" w:cs="Times New Roman" w:eastAsia="Times New Roman"/>
+                <w:b w:val="0"/>
+                <w:i w:val="0"/>
+                <w:sz w:val="17"/>
+              </w:rPr>
+              <w:t>User profile (GET /api/auth/me)</w:t>
+            </w:r>
+          </w:p>
+        </w:tc>
+        <w:tc>
+          <w:tcPr>
+            <w:tcW w:type="dxa" w:w="2381"/>
+          </w:tcPr>
+          <w:p>
+            <w:pPr>
+              <w:spacing w:after="20" w:before="40"/>
+            </w:pPr>
+            <w:r>
+              <w:rPr>
+                <w:rFonts w:ascii="Times New Roman" w:hAnsi="Times New Roman" w:cs="Times New Roman" w:eastAsia="Times New Roman"/>
+                <w:b w:val="0"/>
+                <w:i w:val="0"/>
+                <w:sz w:val="17"/>
+              </w:rPr>
+              <w:t>about 0.04 s</w:t>
+            </w:r>
+          </w:p>
+        </w:tc>
+      </w:tr>
+      <w:tr>
+        <w:tc>
+          <w:tcPr>
+            <w:tcW w:type="dxa" w:w="6576"/>
+          </w:tcPr>
+          <w:p>
+            <w:pPr>
+              <w:spacing w:after="20" w:before="40"/>
+            </w:pPr>
+            <w:r>
+              <w:rPr>
+                <w:rFonts w:ascii="Times New Roman" w:hAnsi="Times New Roman" w:cs="Times New Roman" w:eastAsia="Times New Roman"/>
+                <w:b w:val="0"/>
+                <w:i w:val="0"/>
+                <w:sz w:val="17"/>
+              </w:rPr>
+              <w:t>Create emergency contact (POST)</w:t>
+            </w:r>
+          </w:p>
+        </w:tc>
+        <w:tc>
+          <w:tcPr>
+            <w:tcW w:type="dxa" w:w="2381"/>
+          </w:tcPr>
+          <w:p>
+            <w:pPr>
+              <w:spacing w:after="20" w:before="40"/>
+            </w:pPr>
+            <w:r>
+              <w:rPr>
+                <w:rFonts w:ascii="Times New Roman" w:hAnsi="Times New Roman" w:cs="Times New Roman" w:eastAsia="Times New Roman"/>
+                <w:b w:val="0"/>
+                <w:i w:val="0"/>
+                <w:sz w:val="17"/>
+              </w:rPr>
+              <w:t>about 0.02 s</w:t>
+            </w:r>
+          </w:p>
+        </w:tc>
+      </w:tr>
+      <w:tr>
+        <w:tc>
+          <w:tcPr>
+            <w:tcW w:type="dxa" w:w="6576"/>
+          </w:tcPr>
+          <w:p>
+            <w:pPr>
+              <w:spacing w:after="20" w:before="40"/>
+            </w:pPr>
+            <w:r>
+              <w:rPr>
+                <w:rFonts w:ascii="Times New Roman" w:hAnsi="Times New Roman" w:cs="Times New Roman" w:eastAsia="Times New Roman"/>
+                <w:b w:val="0"/>
+                <w:i w:val="0"/>
+                <w:sz w:val="17"/>
+              </w:rPr>
+              <w:t>List own contacts (GET)</w:t>
+            </w:r>
+          </w:p>
+        </w:tc>
+        <w:tc>
+          <w:tcPr>
+            <w:tcW w:type="dxa" w:w="2381"/>
+          </w:tcPr>
+          <w:p>
+            <w:pPr>
+              <w:spacing w:after="20" w:before="40"/>
+            </w:pPr>
+            <w:r>
+              <w:rPr>
+                <w:rFonts w:ascii="Times New Roman" w:hAnsi="Times New Roman" w:cs="Times New Roman" w:eastAsia="Times New Roman"/>
+                <w:b w:val="0"/>
+                <w:i w:val="0"/>
+                <w:sz w:val="17"/>
+              </w:rPr>
+              <w:t>about 0.05 s</w:t>
+            </w:r>
+          </w:p>
+        </w:tc>
+      </w:tr>
+      <w:tr>
+        <w:tc>
+          <w:tcPr>
+            <w:tcW w:type="dxa" w:w="6576"/>
+          </w:tcPr>
+          <w:p>
+            <w:pPr>
+              <w:spacing w:after="20" w:before="40"/>
+            </w:pPr>
+            <w:r>
+              <w:rPr>
+                <w:rFonts w:ascii="Times New Roman" w:hAnsi="Times New Roman" w:cs="Times New Roman" w:eastAsia="Times New Roman"/>
+                <w:b w:val="0"/>
+                <w:i w:val="0"/>
+                <w:sz w:val="17"/>
+              </w:rPr>
+              <w:t>List all contacts, administrator (GET)</w:t>
+            </w:r>
+          </w:p>
+        </w:tc>
+        <w:tc>
+          <w:tcPr>
+            <w:tcW w:type="dxa" w:w="2381"/>
+          </w:tcPr>
+          <w:p>
+            <w:pPr>
+              <w:spacing w:after="20" w:before="40"/>
+            </w:pPr>
+            <w:r>
+              <w:rPr>
+                <w:rFonts w:ascii="Times New Roman" w:hAnsi="Times New Roman" w:cs="Times New Roman" w:eastAsia="Times New Roman"/>
+                <w:b w:val="0"/>
+                <w:i w:val="0"/>
+                <w:sz w:val="17"/>
+              </w:rPr>
+              <w:t>about 0.06 s</w:t>
+            </w:r>
+          </w:p>
+        </w:tc>
+      </w:tr>
+      <w:tr>
+        <w:tc>
+          <w:tcPr>
+            <w:tcW w:type="dxa" w:w="6576"/>
+          </w:tcPr>
+          <w:p>
+            <w:pPr>
+              <w:spacing w:after="20" w:before="40"/>
+            </w:pPr>
+            <w:r>
+              <w:rPr>
+                <w:rFonts w:ascii="Times New Roman" w:hAnsi="Times New Roman" w:cs="Times New Roman" w:eastAsia="Times New Roman"/>
+                <w:b w:val="0"/>
+                <w:i w:val="0"/>
+                <w:sz w:val="17"/>
+              </w:rPr>
+              <w:t>Update and delete a contact, administrator</w:t>
+            </w:r>
+          </w:p>
+        </w:tc>
+        <w:tc>
+          <w:tcPr>
+            <w:tcW w:type="dxa" w:w="2381"/>
+          </w:tcPr>
+          <w:p>
+            <w:pPr>
+              <w:spacing w:after="20" w:before="40"/>
+            </w:pPr>
+            <w:r>
+              <w:rPr>
+                <w:rFonts w:ascii="Times New Roman" w:hAnsi="Times New Roman" w:cs="Times New Roman" w:eastAsia="Times New Roman"/>
+                <w:b w:val="0"/>
+                <w:i w:val="0"/>
+                <w:sz w:val="17"/>
+              </w:rPr>
+              <w:t>about 0.07 s</w:t>
+            </w:r>
+          </w:p>
+        </w:tc>
+      </w:tr>
+      <w:tr>
+        <w:tc>
+          <w:tcPr>
+            <w:tcW w:type="dxa" w:w="6576"/>
+          </w:tcPr>
+          <w:p>
+            <w:pPr>
+              <w:spacing w:after="20" w:before="40"/>
+            </w:pPr>
+            <w:r>
+              <w:rPr>
+                <w:rFonts w:ascii="Times New Roman" w:hAnsi="Times New Roman" w:cs="Times New Roman" w:eastAsia="Times New Roman"/>
+                <w:b w:val="0"/>
+                <w:i w:val="0"/>
+                <w:sz w:val="17"/>
+              </w:rPr>
+              <w:t>Login (includes bcrypt comparison)</w:t>
+            </w:r>
+          </w:p>
+        </w:tc>
+        <w:tc>
+          <w:tcPr>
+            <w:tcW w:type="dxa" w:w="2381"/>
+          </w:tcPr>
+          <w:p>
+            <w:pPr>
+              <w:spacing w:after="20" w:before="40"/>
+            </w:pPr>
+            <w:r>
+              <w:rPr>
+                <w:rFonts w:ascii="Times New Roman" w:hAnsi="Times New Roman" w:cs="Times New Roman" w:eastAsia="Times New Roman"/>
+                <w:b w:val="0"/>
+                <w:i w:val="0"/>
+                <w:sz w:val="17"/>
+              </w:rPr>
+              <w:t>about 0.8 s</w:t>
+            </w:r>
+          </w:p>
+        </w:tc>
+      </w:tr>
+      <w:tr>
+        <w:tc>
+          <w:tcPr>
+            <w:tcW w:type="dxa" w:w="6576"/>
+          </w:tcPr>
+          <w:p>
+            <w:pPr>
+              <w:spacing w:after="20" w:before="40"/>
+            </w:pPr>
+            <w:r>
+              <w:rPr>
+                <w:rFonts w:ascii="Times New Roman" w:hAnsi="Times New Roman" w:cs="Times New Roman" w:eastAsia="Times New Roman"/>
+                <w:b w:val="0"/>
+                <w:i w:val="0"/>
+                <w:sz w:val="17"/>
+              </w:rPr>
+              <w:t>Register new account (includes bcrypt hashing)</w:t>
+            </w:r>
+          </w:p>
+        </w:tc>
+        <w:tc>
+          <w:tcPr>
+            <w:tcW w:type="dxa" w:w="2381"/>
+          </w:tcPr>
+          <w:p>
+            <w:pPr>
+              <w:spacing w:after="20" w:before="40"/>
+            </w:pPr>
+            <w:r>
+              <w:rPr>
+                <w:rFonts w:ascii="Times New Roman" w:hAnsi="Times New Roman" w:cs="Times New Roman" w:eastAsia="Times New Roman"/>
+                <w:b w:val="0"/>
+                <w:i w:val="0"/>
+                <w:sz w:val="17"/>
+              </w:rPr>
+              <w:t>about 1.3 s</w:t>
+            </w:r>
+          </w:p>
+        </w:tc>
+      </w:tr>
+    </w:tbl>
+    <w:p>
+      <w:pPr>
+        <w:spacing w:after="120" w:line="240" w:lineRule="auto"/>
+      </w:pPr>
+    </w:p>
+    <w:p>
+      <w:pPr>
+        <w:spacing w:after="80" w:before="80" w:line="269" w:lineRule="auto"/>
+      </w:pPr>
+      <w:r>
+        <w:rPr>
+          <w:rFonts w:ascii="Times New Roman" w:hAnsi="Times New Roman" w:cs="Times New Roman" w:eastAsia="Times New Roman"/>
+          <w:b w:val="0"/>
+          <w:i w:val="0"/>
+          <w:sz w:val="24"/>
+        </w:rPr>
+        <w:t>Almost every operation completes in well under a tenth of a second. The two noticeably slower requests are login and registration, and there is a deliberate reason: both carry the bcrypt cost factor of twelve rounds, the price paid for keeping password hashes resistant to cracking – a consciously sound trade for a safety product. Page navigation, dashboard loading and SOS submission stayed within the same comfortable range during the browser runs. Formal load and soak testing with large numbers of concurrent users was not part of this exercise; that boundary is recorded honestly in Section 6.10.</w:t>
       </w:r>
     </w:p>
     <w:p>

</xml_diff>